<commit_message>
Start and finish email server project
</commit_message>
<xml_diff>
--- a/001 - estudo pessoal/011 - Servidor de email/Manual Passo a Passo servidor de email.docx
+++ b/001 - estudo pessoal/011 - Servidor de email/Manual Passo a Passo servidor de email.docx
@@ -1,6 +1,6 @@
 
 <file path=word/document.xml><?xml version="1.0" encoding="utf-8"?>
-<w:document xmlns:wpc="http://schemas.microsoft.com/office/word/2010/wordprocessingCanvas" xmlns:cx="http://schemas.microsoft.com/office/drawing/2014/chartex" xmlns:cx1="http://schemas.microsoft.com/office/drawing/2015/9/8/chartex" xmlns:cx2="http://schemas.microsoft.com/office/drawing/2015/10/21/chartex" xmlns:cx3="http://schemas.microsoft.com/office/drawing/2016/5/9/chartex" xmlns:cx4="http://schemas.microsoft.com/office/drawing/2016/5/10/chartex" xmlns:cx5="http://schemas.microsoft.com/office/drawing/2016/5/11/chartex" xmlns:cx6="http://schemas.microsoft.com/office/drawing/2016/5/12/chartex" xmlns:cx7="http://schemas.microsoft.com/office/drawing/2016/5/13/chartex" xmlns:cx8="http://schemas.microsoft.com/office/drawing/2016/5/14/chartex" xmlns:mc="http://schemas.openxmlformats.org/markup-compatibility/2006" xmlns:aink="http://schemas.microsoft.com/office/drawing/2016/ink" xmlns:am3d="http://schemas.microsoft.com/office/drawing/2017/model3d" xmlns:o="urn:schemas-microsoft-com:office:office" xmlns:oel="http://schemas.microsoft.com/office/2019/extlst" xmlns:r="http://schemas.openxmlformats.org/officeDocument/2006/relationships" xmlns:m="http://schemas.openxmlformats.org/officeDocument/2006/math" xmlns:v="urn:schemas-microsoft-com:vml" xmlns:wp14="http://schemas.microsoft.com/office/word/2010/wordprocessingDrawing" xmlns:wp="http://schemas.openxmlformats.org/drawingml/2006/wordprocessingDrawing" xmlns:w10="urn:schemas-microsoft-com:office:word" xmlns:w="http://schemas.openxmlformats.org/wordprocessingml/2006/main" xmlns:w14="http://schemas.microsoft.com/office/word/2010/wordml" xmlns:w15="http://schemas.microsoft.com/office/word/2012/wordml" xmlns:w16cei="http://schemas.microsoft.com/office/word/2026/wordml/cei" xmlns:w16cex="http://schemas.microsoft.com/office/word/2018/wordml/cex" xmlns:w16cid="http://schemas.microsoft.com/office/word/2016/wordml/cid" xmlns:w16="http://schemas.microsoft.com/office/word/2018/wordml" xmlns:w16du="http://schemas.microsoft.com/office/word/2023/wordml/word16du" xmlns:w16sdtdh="http://schemas.microsoft.com/office/word/2020/wordml/sdtdatahash" xmlns:w16sdtfl="http://schemas.microsoft.com/office/word/2024/wordml/sdtformatlock" xmlns:w16se="http://schemas.microsoft.com/office/word/2015/wordml/symex" xmlns:wpg="http://schemas.microsoft.com/office/word/2010/wordprocessingGroup" xmlns:wpi="http://schemas.microsoft.com/office/word/2010/wordprocessingInk" xmlns:wne="http://schemas.microsoft.com/office/word/2006/wordml" xmlns:wps="http://schemas.microsoft.com/office/word/2010/wordprocessingShape" mc:Ignorable="w14 w15 w16se w16cid w16 w16cex w16sdtdh w16sdtfl w16du wp14">
+<w:document xmlns:wpc="http://schemas.microsoft.com/office/word/2010/wordprocessingCanvas" xmlns:cx="http://schemas.microsoft.com/office/drawing/2014/chartex" xmlns:cx1="http://schemas.microsoft.com/office/drawing/2015/9/8/chartex" xmlns:cx2="http://schemas.microsoft.com/office/drawing/2015/10/21/chartex" xmlns:cx3="http://schemas.microsoft.com/office/drawing/2016/5/9/chartex" xmlns:cx4="http://schemas.microsoft.com/office/drawing/2016/5/10/chartex" xmlns:cx5="http://schemas.microsoft.com/office/drawing/2016/5/11/chartex" xmlns:cx6="http://schemas.microsoft.com/office/drawing/2016/5/12/chartex" xmlns:cx7="http://schemas.microsoft.com/office/drawing/2016/5/13/chartex" xmlns:cx8="http://schemas.microsoft.com/office/drawing/2016/5/14/chartex" xmlns:mc="http://schemas.openxmlformats.org/markup-compatibility/2006" xmlns:aink="http://schemas.microsoft.com/office/drawing/2016/ink" xmlns:am3d="http://schemas.microsoft.com/office/drawing/2017/model3d" xmlns:o="urn:schemas-microsoft-com:office:office" xmlns:oel="http://schemas.microsoft.com/office/2019/extlst" xmlns:r="http://schemas.openxmlformats.org/officeDocument/2006/relationships" xmlns:m="http://schemas.openxmlformats.org/officeDocument/2006/math" xmlns:v="urn:schemas-microsoft-com:vml" xmlns:wp14="http://schemas.microsoft.com/office/word/2010/wordprocessingDrawing" xmlns:wp="http://schemas.openxmlformats.org/drawingml/2006/wordprocessingDrawing" xmlns:w10="urn:schemas-microsoft-com:office:word" xmlns:w="http://schemas.openxmlformats.org/wordprocessingml/2006/main" xmlns:w14="http://schemas.microsoft.com/office/word/2010/wordml" xmlns:w15="http://schemas.microsoft.com/office/word/2012/wordml" xmlns:w16cex="http://schemas.microsoft.com/office/word/2018/wordml/cex" xmlns:w16cid="http://schemas.microsoft.com/office/word/2016/wordml/cid" xmlns:w16="http://schemas.microsoft.com/office/word/2018/wordml" xmlns:w16du="http://schemas.microsoft.com/office/word/2023/wordml/word16du" xmlns:w16sdtdh="http://schemas.microsoft.com/office/word/2020/wordml/sdtdatahash" xmlns:w16sdtfl="http://schemas.microsoft.com/office/word/2024/wordml/sdtformatlock" xmlns:w16se="http://schemas.microsoft.com/office/word/2015/wordml/symex" xmlns:wpg="http://schemas.microsoft.com/office/word/2010/wordprocessingGroup" xmlns:wpi="http://schemas.microsoft.com/office/word/2010/wordprocessingInk" xmlns:wne="http://schemas.microsoft.com/office/word/2006/wordml" xmlns:wps="http://schemas.microsoft.com/office/word/2010/wordprocessingShape" mc:Ignorable="w14 w15 w16se w16cid w16 w16cex w16sdtdh w16sdtfl w16du wp14">
   <w:body>
     <w:p>
       <w:pPr>
@@ -591,6 +591,9 @@
         <w:jc w:val="center"/>
       </w:pPr>
       <w:r>
+        <w:rPr>
+          <w:noProof/>
+        </w:rPr>
         <w:drawing>
           <wp:inline distT="0" distB="0" distL="0" distR="0" wp14:anchorId="1985C47E" wp14:editId="191DC7D5">
             <wp:extent cx="4686300" cy="2066513"/>
@@ -639,6 +642,9 @@
         <w:jc w:val="center"/>
       </w:pPr>
       <w:r>
+        <w:rPr>
+          <w:noProof/>
+        </w:rPr>
         <w:drawing>
           <wp:inline distT="0" distB="0" distL="0" distR="0" wp14:anchorId="35B3E6BB" wp14:editId="702DB347">
             <wp:extent cx="3914775" cy="3812578"/>
@@ -690,6 +696,9 @@
     </w:p>
     <w:p>
       <w:r>
+        <w:rPr>
+          <w:noProof/>
+        </w:rPr>
         <w:drawing>
           <wp:inline distT="0" distB="0" distL="0" distR="0" wp14:anchorId="7DBDA792" wp14:editId="3BC3A30F">
             <wp:extent cx="5400040" cy="3235325"/>
@@ -759,6 +768,9 @@
         <w:jc w:val="center"/>
       </w:pPr>
       <w:r>
+        <w:rPr>
+          <w:noProof/>
+        </w:rPr>
         <w:drawing>
           <wp:inline distT="0" distB="0" distL="0" distR="0" wp14:anchorId="05EA3BE4" wp14:editId="59DBF469">
             <wp:extent cx="5867616" cy="4876800"/>
@@ -817,6 +829,9 @@
         <w:jc w:val="center"/>
       </w:pPr>
       <w:r>
+        <w:rPr>
+          <w:noProof/>
+        </w:rPr>
         <w:drawing>
           <wp:inline distT="0" distB="0" distL="0" distR="0" wp14:anchorId="3DCF472B" wp14:editId="6BAAEA6F">
             <wp:extent cx="5400040" cy="4729480"/>
@@ -877,6 +892,9 @@
         <w:jc w:val="center"/>
       </w:pPr>
       <w:r>
+        <w:rPr>
+          <w:noProof/>
+        </w:rPr>
         <w:drawing>
           <wp:inline distT="0" distB="0" distL="0" distR="0" wp14:anchorId="2329EDAE" wp14:editId="3F16141E">
             <wp:extent cx="5400040" cy="4859020"/>
@@ -924,9 +942,9 @@
     <w:p/>
     <w:p/>
     <w:p/>
-    <w:p/>
-    <w:p>
-      <w:r>
+    <w:p>
+      <w:r>
+        <w:lastRenderedPageBreak/>
         <w:t>7 – acessar menu do computador 0</w:t>
       </w:r>
     </w:p>
@@ -935,6 +953,9 @@
         <w:jc w:val="center"/>
       </w:pPr>
       <w:r>
+        <w:rPr>
+          <w:noProof/>
+        </w:rPr>
         <w:drawing>
           <wp:inline distT="0" distB="0" distL="0" distR="0" wp14:anchorId="0387D152" wp14:editId="20016B1C">
             <wp:extent cx="4529756" cy="3629025"/>
@@ -986,7 +1007,78 @@
       <w:pPr>
         <w:jc w:val="center"/>
       </w:pPr>
-      <w:r>
+    </w:p>
+    <w:p>
+      <w:pPr>
+        <w:jc w:val="center"/>
+      </w:pPr>
+    </w:p>
+    <w:p>
+      <w:pPr>
+        <w:jc w:val="center"/>
+      </w:pPr>
+    </w:p>
+    <w:p>
+      <w:pPr>
+        <w:jc w:val="center"/>
+      </w:pPr>
+    </w:p>
+    <w:p>
+      <w:pPr>
+        <w:jc w:val="center"/>
+      </w:pPr>
+    </w:p>
+    <w:p>
+      <w:pPr>
+        <w:jc w:val="center"/>
+      </w:pPr>
+    </w:p>
+    <w:p>
+      <w:pPr>
+        <w:jc w:val="center"/>
+      </w:pPr>
+    </w:p>
+    <w:p>
+      <w:pPr>
+        <w:jc w:val="center"/>
+      </w:pPr>
+    </w:p>
+    <w:p>
+      <w:pPr>
+        <w:jc w:val="center"/>
+      </w:pPr>
+    </w:p>
+    <w:p>
+      <w:pPr>
+        <w:jc w:val="center"/>
+      </w:pPr>
+    </w:p>
+    <w:p>
+      <w:pPr>
+        <w:jc w:val="center"/>
+      </w:pPr>
+    </w:p>
+    <w:p>
+      <w:pPr>
+        <w:jc w:val="center"/>
+      </w:pPr>
+    </w:p>
+    <w:p>
+      <w:pPr>
+        <w:jc w:val="center"/>
+      </w:pPr>
+    </w:p>
+    <w:p>
+      <w:pPr>
+        <w:jc w:val="center"/>
+      </w:pPr>
+    </w:p>
+    <w:p>
+      <w:pPr>
+        <w:jc w:val="center"/>
+      </w:pPr>
+      <w:r>
+        <w:lastRenderedPageBreak/>
         <w:t>8 – dentro do menu computador-0 acessar aba desktop e selecionar ip Configuration</w:t>
       </w:r>
     </w:p>
@@ -995,7 +1087,9 @@
         <w:jc w:val="center"/>
       </w:pPr>
       <w:r>
-        <w:lastRenderedPageBreak/>
+        <w:rPr>
+          <w:noProof/>
+        </w:rPr>
         <w:drawing>
           <wp:inline distT="0" distB="0" distL="0" distR="0" wp14:anchorId="234A3F48" wp14:editId="48B00402">
             <wp:extent cx="4657725" cy="3744691"/>
@@ -1034,6 +1128,22 @@
       </w:r>
     </w:p>
     <w:p/>
+    <w:p/>
+    <w:p/>
+    <w:p/>
+    <w:p/>
+    <w:p/>
+    <w:p/>
+    <w:p/>
+    <w:p/>
+    <w:p/>
+    <w:p/>
+    <w:p/>
+    <w:p/>
+    <w:p/>
+    <w:p/>
+    <w:p/>
+    <w:p/>
     <w:p>
       <w:r>
         <w:t>9 – dentro de IP configuration definir o DHCP, apos isso automaticamente sera gerado um DHCP com base no que foi definido no servidor</w:t>
@@ -1042,7 +1152,9 @@
     <w:p/>
     <w:p>
       <w:r>
-        <w:lastRenderedPageBreak/>
+        <w:rPr>
+          <w:noProof/>
+        </w:rPr>
         <w:drawing>
           <wp:inline distT="0" distB="0" distL="0" distR="0" wp14:anchorId="46EADD24" wp14:editId="5B45C9D5">
             <wp:extent cx="5400040" cy="4577080"/>
@@ -1096,16 +1208,21 @@
     <w:p/>
     <w:p>
       <w:r>
-        <w:lastRenderedPageBreak/>
         <w:t>10 – geracao automatica, repetido cenarios para os outros 3 computadores</w:t>
       </w:r>
     </w:p>
     <w:p>
-      <w:r>
+      <w:pPr>
+        <w:jc w:val="center"/>
+      </w:pPr>
+      <w:r>
+        <w:rPr>
+          <w:noProof/>
+        </w:rPr>
         <w:drawing>
-          <wp:inline distT="0" distB="0" distL="0" distR="0" wp14:anchorId="44DD8A9C" wp14:editId="38007D1D">
-            <wp:extent cx="5400040" cy="5641975"/>
-            <wp:effectExtent l="0" t="0" r="0" b="0"/>
+          <wp:inline distT="0" distB="0" distL="0" distR="0" wp14:anchorId="44DD8A9C" wp14:editId="7A5A35D6">
+            <wp:extent cx="5248275" cy="5483411"/>
+            <wp:effectExtent l="0" t="0" r="0" b="3175"/>
             <wp:docPr id="1203663923" name="Picture 1"/>
             <wp:cNvGraphicFramePr>
               <a:graphicFrameLocks xmlns:a="http://schemas.openxmlformats.org/drawingml/2006/main" noChangeAspect="1"/>
@@ -1126,7 +1243,7 @@
                   <pic:spPr>
                     <a:xfrm>
                       <a:off x="0" y="0"/>
-                      <a:ext cx="5400040" cy="5641975"/>
+                      <a:ext cx="5255594" cy="5491058"/>
                     </a:xfrm>
                     <a:prstGeom prst="rect">
                       <a:avLst/>
@@ -1151,17 +1268,22 @@
     <w:p/>
     <w:p>
       <w:r>
-        <w:lastRenderedPageBreak/>
-        <w:t>11 – simulacao de teste dos cenarios em rede por envio de email</w:t>
-      </w:r>
-    </w:p>
-    <w:p>
+        <w:t xml:space="preserve">11 – </w:t>
+      </w:r>
+      <w:r>
+        <w:t>A partir daqui vai ser a configuracao de e-mail e nao a configuracao do projeto anterior. Irei continuar o uso do protocolo DHCP e irei na parte do menu servidor -&gt; Services -&gt; email</w:t>
+      </w:r>
+    </w:p>
+    <w:p>
+      <w:pPr>
+        <w:jc w:val="center"/>
+      </w:pPr>
       <w:r>
         <w:drawing>
-          <wp:inline distT="0" distB="0" distL="0" distR="0" wp14:anchorId="5F4AA6F8" wp14:editId="50352267">
-            <wp:extent cx="4076700" cy="2350910"/>
-            <wp:effectExtent l="0" t="0" r="0" b="0"/>
-            <wp:docPr id="1013126491" name="Picture 1"/>
+          <wp:inline distT="0" distB="0" distL="0" distR="0" wp14:anchorId="0BF5BFB2" wp14:editId="33F7395C">
+            <wp:extent cx="4667250" cy="4985571"/>
+            <wp:effectExtent l="0" t="0" r="0" b="5715"/>
+            <wp:docPr id="1651255793" name="Picture 1"/>
             <wp:cNvGraphicFramePr>
               <a:graphicFrameLocks xmlns:a="http://schemas.openxmlformats.org/drawingml/2006/main" noChangeAspect="1"/>
             </wp:cNvGraphicFramePr>
@@ -1169,7 +1291,7 @@
               <a:graphicData uri="http://schemas.openxmlformats.org/drawingml/2006/picture">
                 <pic:pic xmlns:pic="http://schemas.openxmlformats.org/drawingml/2006/picture">
                   <pic:nvPicPr>
-                    <pic:cNvPr id="1013126491" name=""/>
+                    <pic:cNvPr id="1651255793" name=""/>
                     <pic:cNvPicPr/>
                   </pic:nvPicPr>
                   <pic:blipFill>
@@ -1181,7 +1303,7 @@
                   <pic:spPr>
                     <a:xfrm>
                       <a:off x="0" y="0"/>
-                      <a:ext cx="4082145" cy="2354050"/>
+                      <a:ext cx="4670291" cy="4988819"/>
                     </a:xfrm>
                     <a:prstGeom prst="rect">
                       <a:avLst/>
@@ -1194,23 +1316,37 @@
         </w:drawing>
       </w:r>
     </w:p>
-    <w:p>
-      <w:pPr>
-        <w:rPr>
-          <w:b/>
-          <w:bCs/>
-        </w:rPr>
-      </w:pPr>
-      <w:r>
-        <w:rPr>
-          <w:b/>
-          <w:bCs/>
-        </w:rPr>
+    <w:p/>
+    <w:p/>
+    <w:p/>
+    <w:p/>
+    <w:p/>
+    <w:p/>
+    <w:p/>
+    <w:p/>
+    <w:p/>
+    <w:p/>
+    <w:p>
+      <w:r>
+        <w:t xml:space="preserve">12 </w:t>
+      </w:r>
+      <w:r>
+        <w:t>–</w:t>
+      </w:r>
+      <w:r>
+        <w:t xml:space="preserve"> </w:t>
+      </w:r>
+      <w:r>
+        <w:t>apos disso irei colocar um domain name para o servidor email, criando um usuario de acesso para a operacao</w:t>
+      </w:r>
+    </w:p>
+    <w:p>
+      <w:r>
         <w:drawing>
-          <wp:inline distT="0" distB="0" distL="0" distR="0" wp14:anchorId="00A80FF8" wp14:editId="7B5CE53D">
-            <wp:extent cx="4371975" cy="2523242"/>
-            <wp:effectExtent l="0" t="0" r="0" b="0"/>
-            <wp:docPr id="2135406524" name="Picture 1"/>
+          <wp:inline distT="0" distB="0" distL="0" distR="0" wp14:anchorId="1080BF1A" wp14:editId="3A5B4F97">
+            <wp:extent cx="5400040" cy="2905125"/>
+            <wp:effectExtent l="0" t="0" r="0" b="9525"/>
+            <wp:docPr id="951839366" name="Picture 1"/>
             <wp:cNvGraphicFramePr>
               <a:graphicFrameLocks xmlns:a="http://schemas.openxmlformats.org/drawingml/2006/main" noChangeAspect="1"/>
             </wp:cNvGraphicFramePr>
@@ -1218,7 +1354,7 @@
               <a:graphicData uri="http://schemas.openxmlformats.org/drawingml/2006/picture">
                 <pic:pic xmlns:pic="http://schemas.openxmlformats.org/drawingml/2006/picture">
                   <pic:nvPicPr>
-                    <pic:cNvPr id="2135406524" name=""/>
+                    <pic:cNvPr id="951839366" name=""/>
                     <pic:cNvPicPr/>
                   </pic:nvPicPr>
                   <pic:blipFill>
@@ -1230,7 +1366,7 @@
                   <pic:spPr>
                     <a:xfrm>
                       <a:off x="0" y="0"/>
-                      <a:ext cx="4374314" cy="2524592"/>
+                      <a:ext cx="5400040" cy="2905125"/>
                     </a:xfrm>
                     <a:prstGeom prst="rect">
                       <a:avLst/>
@@ -1243,23 +1379,29 @@
         </w:drawing>
       </w:r>
     </w:p>
-    <w:p>
-      <w:pPr>
-        <w:rPr>
-          <w:b/>
-          <w:bCs/>
-        </w:rPr>
-      </w:pPr>
-      <w:r>
-        <w:rPr>
-          <w:b/>
-          <w:bCs/>
-        </w:rPr>
+    <w:p/>
+    <w:p>
+      <w:r>
+        <w:t>13 – definir a configuracao de email de acesso nos computadores conectados</w:t>
+      </w:r>
+      <w:r>
+        <w:t xml:space="preserve">. Acessando </w:t>
+      </w:r>
+      <w:r>
+        <w:t>Menu Computador 0 -&gt; DESKTOP -&gt; Email</w:t>
+      </w:r>
+    </w:p>
+    <w:p>
+      <w:pPr>
+        <w:jc w:val="center"/>
+      </w:pPr>
+      <w:r>
+        <w:lastRenderedPageBreak/>
         <w:drawing>
-          <wp:inline distT="0" distB="0" distL="0" distR="0" wp14:anchorId="6C73A1C3" wp14:editId="2081ABE7">
-            <wp:extent cx="3458225" cy="2276475"/>
-            <wp:effectExtent l="0" t="0" r="8890" b="0"/>
-            <wp:docPr id="1669851686" name="Picture 1"/>
+          <wp:inline distT="0" distB="0" distL="0" distR="0" wp14:anchorId="15F9B79A" wp14:editId="0131CE4C">
+            <wp:extent cx="5400040" cy="4500245"/>
+            <wp:effectExtent l="0" t="0" r="0" b="0"/>
+            <wp:docPr id="992098136" name="Picture 1"/>
             <wp:cNvGraphicFramePr>
               <a:graphicFrameLocks xmlns:a="http://schemas.openxmlformats.org/drawingml/2006/main" noChangeAspect="1"/>
             </wp:cNvGraphicFramePr>
@@ -1267,7 +1409,7 @@
               <a:graphicData uri="http://schemas.openxmlformats.org/drawingml/2006/picture">
                 <pic:pic xmlns:pic="http://schemas.openxmlformats.org/drawingml/2006/picture">
                   <pic:nvPicPr>
-                    <pic:cNvPr id="1669851686" name=""/>
+                    <pic:cNvPr id="992098136" name=""/>
                     <pic:cNvPicPr/>
                   </pic:nvPicPr>
                   <pic:blipFill>
@@ -1279,7 +1421,360 @@
                   <pic:spPr>
                     <a:xfrm>
                       <a:off x="0" y="0"/>
-                      <a:ext cx="3459600" cy="2277380"/>
+                      <a:ext cx="5400040" cy="4500245"/>
+                    </a:xfrm>
+                    <a:prstGeom prst="rect">
+                      <a:avLst/>
+                    </a:prstGeom>
+                  </pic:spPr>
+                </pic:pic>
+              </a:graphicData>
+            </a:graphic>
+          </wp:inline>
+        </w:drawing>
+      </w:r>
+    </w:p>
+    <w:p>
+      <w:r>
+        <w:t>14 – Colocar as informacoes do email registrado, usuario utilizando, ip de origem do servidor e ip de envio do servidor. Apos isso salvar as informacoes</w:t>
+      </w:r>
+    </w:p>
+    <w:p>
+      <w:r>
+        <w:drawing>
+          <wp:inline distT="0" distB="0" distL="0" distR="0" wp14:anchorId="59625586" wp14:editId="22BFBFE5">
+            <wp:extent cx="5400040" cy="2914015"/>
+            <wp:effectExtent l="0" t="0" r="0" b="635"/>
+            <wp:docPr id="1908297789" name="Picture 1"/>
+            <wp:cNvGraphicFramePr>
+              <a:graphicFrameLocks xmlns:a="http://schemas.openxmlformats.org/drawingml/2006/main" noChangeAspect="1"/>
+            </wp:cNvGraphicFramePr>
+            <a:graphic xmlns:a="http://schemas.openxmlformats.org/drawingml/2006/main">
+              <a:graphicData uri="http://schemas.openxmlformats.org/drawingml/2006/picture">
+                <pic:pic xmlns:pic="http://schemas.openxmlformats.org/drawingml/2006/picture">
+                  <pic:nvPicPr>
+                    <pic:cNvPr id="1908297789" name=""/>
+                    <pic:cNvPicPr/>
+                  </pic:nvPicPr>
+                  <pic:blipFill>
+                    <a:blip r:embed="rId19"/>
+                    <a:stretch>
+                      <a:fillRect/>
+                    </a:stretch>
+                  </pic:blipFill>
+                  <pic:spPr>
+                    <a:xfrm>
+                      <a:off x="0" y="0"/>
+                      <a:ext cx="5400040" cy="2914015"/>
+                    </a:xfrm>
+                    <a:prstGeom prst="rect">
+                      <a:avLst/>
+                    </a:prstGeom>
+                  </pic:spPr>
+                </pic:pic>
+              </a:graphicData>
+            </a:graphic>
+          </wp:inline>
+        </w:drawing>
+      </w:r>
+    </w:p>
+    <w:p/>
+    <w:p>
+      <w:r>
+        <w:lastRenderedPageBreak/>
+        <w:drawing>
+          <wp:inline distT="0" distB="0" distL="0" distR="0" wp14:anchorId="51820ED4" wp14:editId="64C6C9D9">
+            <wp:extent cx="5400040" cy="2753995"/>
+            <wp:effectExtent l="0" t="0" r="0" b="8255"/>
+            <wp:docPr id="1838466155" name="Picture 1"/>
+            <wp:cNvGraphicFramePr>
+              <a:graphicFrameLocks xmlns:a="http://schemas.openxmlformats.org/drawingml/2006/main" noChangeAspect="1"/>
+            </wp:cNvGraphicFramePr>
+            <a:graphic xmlns:a="http://schemas.openxmlformats.org/drawingml/2006/main">
+              <a:graphicData uri="http://schemas.openxmlformats.org/drawingml/2006/picture">
+                <pic:pic xmlns:pic="http://schemas.openxmlformats.org/drawingml/2006/picture">
+                  <pic:nvPicPr>
+                    <pic:cNvPr id="1838466155" name=""/>
+                    <pic:cNvPicPr/>
+                  </pic:nvPicPr>
+                  <pic:blipFill>
+                    <a:blip r:embed="rId20"/>
+                    <a:stretch>
+                      <a:fillRect/>
+                    </a:stretch>
+                  </pic:blipFill>
+                  <pic:spPr>
+                    <a:xfrm>
+                      <a:off x="0" y="0"/>
+                      <a:ext cx="5400040" cy="2753995"/>
+                    </a:xfrm>
+                    <a:prstGeom prst="rect">
+                      <a:avLst/>
+                    </a:prstGeom>
+                  </pic:spPr>
+                </pic:pic>
+              </a:graphicData>
+            </a:graphic>
+          </wp:inline>
+        </w:drawing>
+      </w:r>
+    </w:p>
+    <w:p/>
+    <w:p/>
+    <w:p/>
+    <w:p/>
+    <w:p/>
+    <w:p/>
+    <w:p/>
+    <w:p>
+      <w:r>
+        <w:t>15 – Apos isso irei criar um email para a maquina 2 seguindo o mesmo prossedimento. Registrando um email no menu computador 2 -&gt; DESKTOP -&gt; Email. Confugurando tudo para o usuario 3 e depois enviando um email para o usuario 1</w:t>
+      </w:r>
+      <w:r>
+        <w:t>.</w:t>
+      </w:r>
+    </w:p>
+    <w:p>
+      <w:r>
+        <w:lastRenderedPageBreak/>
+        <w:drawing>
+          <wp:inline distT="0" distB="0" distL="0" distR="0" wp14:anchorId="6371C5FE" wp14:editId="6EFE8679">
+            <wp:extent cx="5400040" cy="3549015"/>
+            <wp:effectExtent l="0" t="0" r="0" b="0"/>
+            <wp:docPr id="137961391" name="Picture 1"/>
+            <wp:cNvGraphicFramePr>
+              <a:graphicFrameLocks xmlns:a="http://schemas.openxmlformats.org/drawingml/2006/main" noChangeAspect="1"/>
+            </wp:cNvGraphicFramePr>
+            <a:graphic xmlns:a="http://schemas.openxmlformats.org/drawingml/2006/main">
+              <a:graphicData uri="http://schemas.openxmlformats.org/drawingml/2006/picture">
+                <pic:pic xmlns:pic="http://schemas.openxmlformats.org/drawingml/2006/picture">
+                  <pic:nvPicPr>
+                    <pic:cNvPr id="137961391" name=""/>
+                    <pic:cNvPicPr/>
+                  </pic:nvPicPr>
+                  <pic:blipFill>
+                    <a:blip r:embed="rId21"/>
+                    <a:stretch>
+                      <a:fillRect/>
+                    </a:stretch>
+                  </pic:blipFill>
+                  <pic:spPr>
+                    <a:xfrm>
+                      <a:off x="0" y="0"/>
+                      <a:ext cx="5400040" cy="3549015"/>
+                    </a:xfrm>
+                    <a:prstGeom prst="rect">
+                      <a:avLst/>
+                    </a:prstGeom>
+                  </pic:spPr>
+                </pic:pic>
+              </a:graphicData>
+            </a:graphic>
+          </wp:inline>
+        </w:drawing>
+      </w:r>
+    </w:p>
+    <w:p/>
+    <w:p>
+      <w:r>
+        <w:drawing>
+          <wp:inline distT="0" distB="0" distL="0" distR="0" wp14:anchorId="235CD479" wp14:editId="55FDEC4D">
+            <wp:extent cx="5400040" cy="2889885"/>
+            <wp:effectExtent l="0" t="0" r="0" b="5715"/>
+            <wp:docPr id="1756911179" name="Picture 1"/>
+            <wp:cNvGraphicFramePr>
+              <a:graphicFrameLocks xmlns:a="http://schemas.openxmlformats.org/drawingml/2006/main" noChangeAspect="1"/>
+            </wp:cNvGraphicFramePr>
+            <a:graphic xmlns:a="http://schemas.openxmlformats.org/drawingml/2006/main">
+              <a:graphicData uri="http://schemas.openxmlformats.org/drawingml/2006/picture">
+                <pic:pic xmlns:pic="http://schemas.openxmlformats.org/drawingml/2006/picture">
+                  <pic:nvPicPr>
+                    <pic:cNvPr id="1756911179" name=""/>
+                    <pic:cNvPicPr/>
+                  </pic:nvPicPr>
+                  <pic:blipFill>
+                    <a:blip r:embed="rId22"/>
+                    <a:stretch>
+                      <a:fillRect/>
+                    </a:stretch>
+                  </pic:blipFill>
+                  <pic:spPr>
+                    <a:xfrm>
+                      <a:off x="0" y="0"/>
+                      <a:ext cx="5400040" cy="2889885"/>
+                    </a:xfrm>
+                    <a:prstGeom prst="rect">
+                      <a:avLst/>
+                    </a:prstGeom>
+                  </pic:spPr>
+                </pic:pic>
+              </a:graphicData>
+            </a:graphic>
+          </wp:inline>
+        </w:drawing>
+      </w:r>
+    </w:p>
+    <w:p/>
+    <w:p/>
+    <w:p/>
+    <w:p/>
+    <w:p>
+      <w:r>
+        <w:t>16 – apos isso so mandar um email clicando compose</w:t>
+      </w:r>
+      <w:r>
+        <w:t xml:space="preserve"> e montar um email e mandar para o usuario do computador 0 usando o computador 2.</w:t>
+      </w:r>
+    </w:p>
+    <w:p>
+      <w:r>
+        <w:lastRenderedPageBreak/>
+        <w:drawing>
+          <wp:inline distT="0" distB="0" distL="0" distR="0" wp14:anchorId="1D75D826" wp14:editId="017EAEEF">
+            <wp:extent cx="5400040" cy="1567815"/>
+            <wp:effectExtent l="0" t="0" r="0" b="0"/>
+            <wp:docPr id="1170071558" name="Picture 1"/>
+            <wp:cNvGraphicFramePr>
+              <a:graphicFrameLocks xmlns:a="http://schemas.openxmlformats.org/drawingml/2006/main" noChangeAspect="1"/>
+            </wp:cNvGraphicFramePr>
+            <a:graphic xmlns:a="http://schemas.openxmlformats.org/drawingml/2006/main">
+              <a:graphicData uri="http://schemas.openxmlformats.org/drawingml/2006/picture">
+                <pic:pic xmlns:pic="http://schemas.openxmlformats.org/drawingml/2006/picture">
+                  <pic:nvPicPr>
+                    <pic:cNvPr id="1170071558" name=""/>
+                    <pic:cNvPicPr/>
+                  </pic:nvPicPr>
+                  <pic:blipFill>
+                    <a:blip r:embed="rId23"/>
+                    <a:stretch>
+                      <a:fillRect/>
+                    </a:stretch>
+                  </pic:blipFill>
+                  <pic:spPr>
+                    <a:xfrm>
+                      <a:off x="0" y="0"/>
+                      <a:ext cx="5400040" cy="1567815"/>
+                    </a:xfrm>
+                    <a:prstGeom prst="rect">
+                      <a:avLst/>
+                    </a:prstGeom>
+                  </pic:spPr>
+                </pic:pic>
+              </a:graphicData>
+            </a:graphic>
+          </wp:inline>
+        </w:drawing>
+      </w:r>
+    </w:p>
+    <w:p/>
+    <w:p/>
+    <w:p/>
+    <w:p/>
+    <w:p/>
+    <w:p/>
+    <w:p/>
+    <w:p/>
+    <w:p/>
+    <w:p/>
+    <w:p/>
+    <w:p/>
+    <w:p/>
+    <w:p/>
+    <w:p/>
+    <w:p/>
+    <w:p/>
+    <w:p/>
+    <w:p/>
+    <w:p/>
+    <w:p/>
+    <w:p/>
+    <w:p/>
+    <w:p>
+      <w:r>
+        <w:lastRenderedPageBreak/>
+        <w:t>17 – Apos enviar sera apenas preciso entrar no computador 0, acessar o email atraves do menu computador0 - &gt; DESKTOP -&gt; Email e acessar a opcao Receive</w:t>
+      </w:r>
+    </w:p>
+    <w:p>
+      <w:r>
+        <w:drawing>
+          <wp:inline distT="0" distB="0" distL="0" distR="0" wp14:anchorId="3CD41164" wp14:editId="62B5E845">
+            <wp:extent cx="5400040" cy="5720080"/>
+            <wp:effectExtent l="0" t="0" r="0" b="0"/>
+            <wp:docPr id="1421036462" name="Picture 1"/>
+            <wp:cNvGraphicFramePr>
+              <a:graphicFrameLocks xmlns:a="http://schemas.openxmlformats.org/drawingml/2006/main" noChangeAspect="1"/>
+            </wp:cNvGraphicFramePr>
+            <a:graphic xmlns:a="http://schemas.openxmlformats.org/drawingml/2006/main">
+              <a:graphicData uri="http://schemas.openxmlformats.org/drawingml/2006/picture">
+                <pic:pic xmlns:pic="http://schemas.openxmlformats.org/drawingml/2006/picture">
+                  <pic:nvPicPr>
+                    <pic:cNvPr id="1421036462" name=""/>
+                    <pic:cNvPicPr/>
+                  </pic:nvPicPr>
+                  <pic:blipFill>
+                    <a:blip r:embed="rId24"/>
+                    <a:stretch>
+                      <a:fillRect/>
+                    </a:stretch>
+                  </pic:blipFill>
+                  <pic:spPr>
+                    <a:xfrm>
+                      <a:off x="0" y="0"/>
+                      <a:ext cx="5400040" cy="5720080"/>
+                    </a:xfrm>
+                    <a:prstGeom prst="rect">
+                      <a:avLst/>
+                    </a:prstGeom>
+                  </pic:spPr>
+                </pic:pic>
+              </a:graphicData>
+            </a:graphic>
+          </wp:inline>
+        </w:drawing>
+      </w:r>
+    </w:p>
+    <w:p/>
+    <w:p/>
+    <w:p/>
+    <w:p/>
+    <w:p/>
+    <w:p/>
+    <w:p/>
+    <w:p/>
+    <w:p>
+      <w:r>
+        <w:lastRenderedPageBreak/>
+        <w:t>18 – Em seguida acessar o Receive e verificar se recebi o email do usuario 3 do computador 2.</w:t>
+      </w:r>
+    </w:p>
+    <w:p>
+      <w:r>
+        <w:drawing>
+          <wp:inline distT="0" distB="0" distL="0" distR="0" wp14:anchorId="1644EB48" wp14:editId="67053CDF">
+            <wp:extent cx="5400040" cy="5299075"/>
+            <wp:effectExtent l="0" t="0" r="0" b="0"/>
+            <wp:docPr id="1343614926" name="Picture 1"/>
+            <wp:cNvGraphicFramePr>
+              <a:graphicFrameLocks xmlns:a="http://schemas.openxmlformats.org/drawingml/2006/main" noChangeAspect="1"/>
+            </wp:cNvGraphicFramePr>
+            <a:graphic xmlns:a="http://schemas.openxmlformats.org/drawingml/2006/main">
+              <a:graphicData uri="http://schemas.openxmlformats.org/drawingml/2006/picture">
+                <pic:pic xmlns:pic="http://schemas.openxmlformats.org/drawingml/2006/picture">
+                  <pic:nvPicPr>
+                    <pic:cNvPr id="1343614926" name=""/>
+                    <pic:cNvPicPr/>
+                  </pic:nvPicPr>
+                  <pic:blipFill>
+                    <a:blip r:embed="rId25"/>
+                    <a:stretch>
+                      <a:fillRect/>
+                    </a:stretch>
+                  </pic:blipFill>
+                  <pic:spPr>
+                    <a:xfrm>
+                      <a:off x="0" y="0"/>
+                      <a:ext cx="5400040" cy="5299075"/>
                     </a:xfrm>
                     <a:prstGeom prst="rect">
                       <a:avLst/>
@@ -1502,7 +1997,7 @@
 </file>
 
 <file path=word/numbering.xml><?xml version="1.0" encoding="utf-8"?>
-<w:numbering xmlns:wpc="http://schemas.microsoft.com/office/word/2010/wordprocessingCanvas" xmlns:cx="http://schemas.microsoft.com/office/drawing/2014/chartex" xmlns:cx1="http://schemas.microsoft.com/office/drawing/2015/9/8/chartex" xmlns:cx2="http://schemas.microsoft.com/office/drawing/2015/10/21/chartex" xmlns:cx3="http://schemas.microsoft.com/office/drawing/2016/5/9/chartex" xmlns:cx4="http://schemas.microsoft.com/office/drawing/2016/5/10/chartex" xmlns:cx5="http://schemas.microsoft.com/office/drawing/2016/5/11/chartex" xmlns:cx6="http://schemas.microsoft.com/office/drawing/2016/5/12/chartex" xmlns:cx7="http://schemas.microsoft.com/office/drawing/2016/5/13/chartex" xmlns:cx8="http://schemas.microsoft.com/office/drawing/2016/5/14/chartex" xmlns:mc="http://schemas.openxmlformats.org/markup-compatibility/2006" xmlns:aink="http://schemas.microsoft.com/office/drawing/2016/ink" xmlns:am3d="http://schemas.microsoft.com/office/drawing/2017/model3d" xmlns:o="urn:schemas-microsoft-com:office:office" xmlns:oel="http://schemas.microsoft.com/office/2019/extlst" xmlns:r="http://schemas.openxmlformats.org/officeDocument/2006/relationships" xmlns:m="http://schemas.openxmlformats.org/officeDocument/2006/math" xmlns:v="urn:schemas-microsoft-com:vml" xmlns:wp14="http://schemas.microsoft.com/office/word/2010/wordprocessingDrawing" xmlns:wp="http://schemas.openxmlformats.org/drawingml/2006/wordprocessingDrawing" xmlns:w10="urn:schemas-microsoft-com:office:word" xmlns:w="http://schemas.openxmlformats.org/wordprocessingml/2006/main" xmlns:w14="http://schemas.microsoft.com/office/word/2010/wordml" xmlns:w15="http://schemas.microsoft.com/office/word/2012/wordml" xmlns:w16cei="http://schemas.microsoft.com/office/word/2026/wordml/cei" xmlns:w16cex="http://schemas.microsoft.com/office/word/2018/wordml/cex" xmlns:w16cid="http://schemas.microsoft.com/office/word/2016/wordml/cid" xmlns:w16="http://schemas.microsoft.com/office/word/2018/wordml" xmlns:w16du="http://schemas.microsoft.com/office/word/2023/wordml/word16du" xmlns:w16sdtdh="http://schemas.microsoft.com/office/word/2020/wordml/sdtdatahash" xmlns:w16sdtfl="http://schemas.microsoft.com/office/word/2024/wordml/sdtformatlock" xmlns:w16se="http://schemas.microsoft.com/office/word/2015/wordml/symex" xmlns:wpg="http://schemas.microsoft.com/office/word/2010/wordprocessingGroup" xmlns:wpi="http://schemas.microsoft.com/office/word/2010/wordprocessingInk" xmlns:wne="http://schemas.microsoft.com/office/word/2006/wordml" xmlns:wps="http://schemas.microsoft.com/office/word/2010/wordprocessingShape" mc:Ignorable="w14 w15 w16se w16cid w16 w16cex w16sdtdh w16sdtfl w16du wp14">
+<w:numbering xmlns:wpc="http://schemas.microsoft.com/office/word/2010/wordprocessingCanvas" xmlns:cx="http://schemas.microsoft.com/office/drawing/2014/chartex" xmlns:cx1="http://schemas.microsoft.com/office/drawing/2015/9/8/chartex" xmlns:cx2="http://schemas.microsoft.com/office/drawing/2015/10/21/chartex" xmlns:cx3="http://schemas.microsoft.com/office/drawing/2016/5/9/chartex" xmlns:cx4="http://schemas.microsoft.com/office/drawing/2016/5/10/chartex" xmlns:cx5="http://schemas.microsoft.com/office/drawing/2016/5/11/chartex" xmlns:cx6="http://schemas.microsoft.com/office/drawing/2016/5/12/chartex" xmlns:cx7="http://schemas.microsoft.com/office/drawing/2016/5/13/chartex" xmlns:cx8="http://schemas.microsoft.com/office/drawing/2016/5/14/chartex" xmlns:mc="http://schemas.openxmlformats.org/markup-compatibility/2006" xmlns:aink="http://schemas.microsoft.com/office/drawing/2016/ink" xmlns:am3d="http://schemas.microsoft.com/office/drawing/2017/model3d" xmlns:o="urn:schemas-microsoft-com:office:office" xmlns:oel="http://schemas.microsoft.com/office/2019/extlst" xmlns:r="http://schemas.openxmlformats.org/officeDocument/2006/relationships" xmlns:m="http://schemas.openxmlformats.org/officeDocument/2006/math" xmlns:v="urn:schemas-microsoft-com:vml" xmlns:wp14="http://schemas.microsoft.com/office/word/2010/wordprocessingDrawing" xmlns:wp="http://schemas.openxmlformats.org/drawingml/2006/wordprocessingDrawing" xmlns:w10="urn:schemas-microsoft-com:office:word" xmlns:w="http://schemas.openxmlformats.org/wordprocessingml/2006/main" xmlns:w14="http://schemas.microsoft.com/office/word/2010/wordml" xmlns:w15="http://schemas.microsoft.com/office/word/2012/wordml" xmlns:w16cex="http://schemas.microsoft.com/office/word/2018/wordml/cex" xmlns:w16cid="http://schemas.microsoft.com/office/word/2016/wordml/cid" xmlns:w16="http://schemas.microsoft.com/office/word/2018/wordml" xmlns:w16du="http://schemas.microsoft.com/office/word/2023/wordml/word16du" xmlns:w16sdtdh="http://schemas.microsoft.com/office/word/2020/wordml/sdtdatahash" xmlns:w16sdtfl="http://schemas.microsoft.com/office/word/2024/wordml/sdtformatlock" xmlns:w16se="http://schemas.microsoft.com/office/word/2015/wordml/symex" xmlns:wpg="http://schemas.microsoft.com/office/word/2010/wordprocessingGroup" xmlns:wpi="http://schemas.microsoft.com/office/word/2010/wordprocessingInk" xmlns:wne="http://schemas.microsoft.com/office/word/2006/wordml" xmlns:wps="http://schemas.microsoft.com/office/word/2010/wordprocessingShape" mc:Ignorable="w14 w15 w16se w16cid w16 w16cex w16sdtdh w16sdtfl w16du wp14">
   <w:abstractNum w:abstractNumId="0" w15:restartNumberingAfterBreak="0">
     <w:nsid w:val="04BC541F"/>
     <w:multiLevelType w:val="hybridMultilevel"/>
@@ -2991,6 +3486,7 @@
   <w:style w:type="character" w:default="1" w:styleId="DefaultParagraphFont">
     <w:name w:val="Default Paragraph Font"/>
     <w:uiPriority w:val="1"/>
+    <w:semiHidden/>
     <w:unhideWhenUsed/>
   </w:style>
   <w:style w:type="table" w:default="1" w:styleId="TableNormal">

</xml_diff>